<commit_message>
change year range: add 2025, update guide pdf
</commit_message>
<xml_diff>
--- a/public/Service_Research_Compass_2030_User_Guide.docx
+++ b/public/Service_Research_Compass_2030_User_Guide.docx
@@ -21,9 +21,18 @@
     <w:p>
       <w:pPr>
         <w:pStyle w:val="a3"/>
-      </w:pPr>
-      <w:r>
-        <w:t>Service Research Compass 2027</w:t>
+        <w:rPr>
+          <w:rFonts w:eastAsiaTheme="minorEastAsia" w:hint="eastAsia"/>
+        </w:rPr>
+      </w:pPr>
+      <w:r>
+        <w:t>Service Research Compass 20</w:t>
+      </w:r>
+      <w:r>
+        <w:rPr>
+          <w:rFonts w:eastAsiaTheme="minorEastAsia" w:hint="eastAsia"/>
+        </w:rPr>
+        <w:t>30</w:t>
       </w:r>
     </w:p>
     <w:p>
@@ -65,7 +74,7 @@
       <w:pPr>
         <w:pStyle w:val="a8"/>
         <w:rPr>
-          <w:rFonts w:eastAsiaTheme="minorEastAsia" w:hint="eastAsia"/>
+          <w:rFonts w:eastAsiaTheme="minorEastAsia"/>
         </w:rPr>
       </w:pPr>
     </w:p>
@@ -105,7 +114,7 @@
       <w:pPr>
         <w:pStyle w:val="a8"/>
         <w:rPr>
-          <w:rFonts w:eastAsiaTheme="minorEastAsia" w:hint="eastAsia"/>
+          <w:rFonts w:eastAsiaTheme="minorEastAsia"/>
         </w:rPr>
       </w:pPr>
     </w:p>
@@ -297,13 +306,7 @@
     <w:p/>
     <w:p/>
     <w:p/>
-    <w:p>
-      <w:pPr>
-        <w:rPr>
-          <w:rFonts w:hint="eastAsia"/>
-        </w:rPr>
-      </w:pPr>
-    </w:p>
+    <w:p/>
     <w:p>
       <w:pPr>
         <w:pStyle w:val="1"/>
@@ -321,13 +324,28 @@
       </w:pPr>
       <w:bookmarkStart w:id="1" w:name="_Toc214833030"/>
       <w:r>
-        <w:t>1.1 What is Service Research Compass 2027?</w:t>
+        <w:t>1.1 What is Service Research Compass 20</w:t>
+      </w:r>
+      <w:r>
+        <w:rPr>
+          <w:rFonts w:eastAsiaTheme="minorEastAsia" w:hint="eastAsia"/>
+        </w:rPr>
+        <w:t>30</w:t>
+      </w:r>
+      <w:r>
+        <w:t>?</w:t>
       </w:r>
       <w:bookmarkEnd w:id="1"/>
     </w:p>
     <w:p>
       <w:r>
-        <w:t xml:space="preserve">Service Research Compass 2027 is a specialized </w:t>
+        <w:t>Service Research Compass 20</w:t>
+      </w:r>
+      <w:r>
+        <w:t>30</w:t>
+      </w:r>
+      <w:r>
+        <w:t xml:space="preserve"> is a specialized </w:t>
       </w:r>
       <w:r>
         <w:rPr>
@@ -345,7 +363,16 @@
         <w:t>AI model</w:t>
       </w:r>
       <w:r>
-        <w:t xml:space="preserve"> forecasts which concept pairs are likely to be connected by 2027.</w:t>
+        <w:t xml:space="preserve"> forecasts which concept pairs are likely to be connected by 20</w:t>
+      </w:r>
+      <w:r>
+        <w:rPr>
+          <w:rFonts w:hint="eastAsia"/>
+        </w:rPr>
+        <w:t>30</w:t>
+      </w:r>
+      <w:r>
+        <w:t>.</w:t>
       </w:r>
     </w:p>
     <w:p>
@@ -360,7 +387,16 @@
     </w:p>
     <w:p>
       <w:r>
-        <w:t>Predict concept relationships in service research that are likely to emerge by 2027, helping researchers identify promising research directions and emerging interdisciplinary connections.</w:t>
+        <w:t>Predict concept relationships in service research that are likely to emerge by 20</w:t>
+      </w:r>
+      <w:r>
+        <w:rPr>
+          <w:rFonts w:hint="eastAsia"/>
+        </w:rPr>
+        <w:t>30</w:t>
+      </w:r>
+      <w:r>
+        <w:t>, helping researchers identify promising research directions and emerging interdisciplinary connections.</w:t>
       </w:r>
     </w:p>
     <w:p>
@@ -395,7 +431,19 @@
         <w:rPr>
           <w:rFonts w:hint="eastAsia"/>
         </w:rPr>
-        <w:t xml:space="preserve">5,892 </w:t>
+        <w:t>5,</w:t>
+      </w:r>
+      <w:r>
+        <w:rPr>
+          <w:rFonts w:hint="eastAsia"/>
+        </w:rPr>
+        <w:t>725</w:t>
+      </w:r>
+      <w:r>
+        <w:rPr>
+          <w:rFonts w:hint="eastAsia"/>
+        </w:rPr>
+        <w:t xml:space="preserve"> </w:t>
       </w:r>
       <w:r>
         <w:t>Service research</w:t>
@@ -413,7 +461,19 @@
         <w:rPr>
           <w:rFonts w:hint="eastAsia"/>
         </w:rPr>
-        <w:t xml:space="preserve"> and 799 papers from JSR</w:t>
+        <w:t xml:space="preserve"> and </w:t>
+      </w:r>
+      <w:r>
+        <w:rPr>
+          <w:rFonts w:hint="eastAsia"/>
+        </w:rPr>
+        <w:t>811</w:t>
+      </w:r>
+      <w:r>
+        <w:rPr>
+          <w:rFonts w:hint="eastAsia"/>
+        </w:rPr>
+        <w:t xml:space="preserve"> papers from JSR</w:t>
       </w:r>
     </w:p>
     <w:p>
@@ -438,7 +498,13 @@
         <w:rPr>
           <w:rFonts w:hint="eastAsia"/>
         </w:rPr>
-        <w:t>11,170 p</w:t>
+        <w:t>4,976</w:t>
+      </w:r>
+      <w:r>
+        <w:rPr>
+          <w:rFonts w:hint="eastAsia"/>
+        </w:rPr>
+        <w:t xml:space="preserve"> p</w:t>
       </w:r>
       <w:r>
         <w:rPr>
@@ -685,7 +751,16 @@
     </w:p>
     <w:p>
       <w:r>
-        <w:t xml:space="preserve">This component displays concept pairs ranked by prediction score, showing links likely to emerge by 2027 in service research. </w:t>
+        <w:t>This component displays concept pairs ranked by prediction score, showing links likely to emerge by 20</w:t>
+      </w:r>
+      <w:r>
+        <w:rPr>
+          <w:rFonts w:hint="eastAsia"/>
+        </w:rPr>
+        <w:t>30</w:t>
+      </w:r>
+      <w:r>
+        <w:t xml:space="preserve"> in service research. </w:t>
       </w:r>
     </w:p>
     <w:p/>
@@ -763,9 +838,6 @@
         </w:numPr>
         <w:spacing w:line="276" w:lineRule="auto"/>
         <w:ind w:left="800"/>
-        <w:rPr>
-          <w:rFonts w:hint="eastAsia"/>
-        </w:rPr>
       </w:pPr>
       <w:r>
         <w:rPr>
@@ -795,7 +867,6 @@
         </w:numPr>
         <w:spacing w:line="276" w:lineRule="auto"/>
         <w:rPr>
-          <w:rFonts w:hint="eastAsia"/>
           <w:b/>
           <w:bCs/>
         </w:rPr>
@@ -816,7 +887,16 @@
         <w:t xml:space="preserve">: </w:t>
       </w:r>
       <w:r>
-        <w:t>Two concepts predicted to connect by 2027. These pairs do not currently co-occur but are likely to emerge</w:t>
+        <w:t>Two concepts predicted to connect by 20</w:t>
+      </w:r>
+      <w:r>
+        <w:rPr>
+          <w:rFonts w:hint="eastAsia"/>
+        </w:rPr>
+        <w:t>30</w:t>
+      </w:r>
+      <w:r>
+        <w:t>. These pairs do not currently co-occur but are likely to emerge</w:t>
       </w:r>
     </w:p>
     <w:p>
@@ -828,7 +908,6 @@
         </w:numPr>
         <w:spacing w:line="276" w:lineRule="auto"/>
         <w:rPr>
-          <w:rFonts w:hint="eastAsia"/>
           <w:b/>
           <w:bCs/>
         </w:rPr>
@@ -861,7 +940,6 @@
         </w:numPr>
         <w:spacing w:line="276" w:lineRule="auto"/>
         <w:rPr>
-          <w:rFonts w:hint="eastAsia"/>
           <w:b/>
           <w:bCs/>
         </w:rPr>
@@ -901,16 +979,6 @@
       <w:r>
         <w:t>A more detailed explanation is provided in Section 4.2</w:t>
       </w:r>
-    </w:p>
-    <w:p/>
-    <w:p/>
-    <w:p/>
-    <w:p>
-      <w:pPr>
-        <w:rPr>
-          <w:rFonts w:hint="eastAsia"/>
-        </w:rPr>
-      </w:pPr>
     </w:p>
     <w:p/>
     <w:p/>
@@ -919,13 +987,11 @@
     <w:p/>
     <w:p/>
     <w:p/>
-    <w:p>
-      <w:pPr>
-        <w:rPr>
-          <w:rFonts w:hint="eastAsia"/>
-        </w:rPr>
-      </w:pPr>
-    </w:p>
+    <w:p/>
+    <w:p/>
+    <w:p/>
+    <w:p/>
+    <w:p/>
     <w:p>
       <w:pPr>
         <w:pStyle w:val="2"/>
@@ -1123,13 +1189,7 @@
     </w:p>
     <w:p/>
     <w:p/>
-    <w:p>
-      <w:pPr>
-        <w:rPr>
-          <w:rFonts w:hint="eastAsia"/>
-        </w:rPr>
-      </w:pPr>
-    </w:p>
+    <w:p/>
     <w:p>
       <w:pPr>
         <w:pStyle w:val="3"/>
@@ -1278,6 +1338,9 @@
     </w:p>
     <w:p>
       <w:r>
+        <w:rPr>
+          <w:noProof/>
+        </w:rPr>
         <w:drawing>
           <wp:inline distT="0" distB="0" distL="0" distR="0" wp14:anchorId="077F834F" wp14:editId="64081298">
             <wp:extent cx="5731510" cy="5075555"/>
@@ -1340,11 +1403,6 @@
       <w:bookmarkEnd w:id="14"/>
     </w:p>
     <w:p>
-      <w:pPr>
-        <w:rPr>
-          <w:rFonts w:hint="eastAsia"/>
-        </w:rPr>
-      </w:pPr>
       <w:r>
         <w:rPr>
           <w:b/>
@@ -1385,21 +1443,13 @@
         <w:t xml:space="preserve"> Node size is p</w:t>
       </w:r>
       <w:r>
-        <w:t>roportional to number of concept pairs in that community</w:t>
-      </w:r>
-      <w:r>
-        <w:t xml:space="preserve"> </w:t>
+        <w:t xml:space="preserve">roportional to number of concept pairs in that community </w:t>
       </w:r>
       <w:r>
         <w:t>(Larger node = more concept pairs)</w:t>
       </w:r>
     </w:p>
     <w:p>
-      <w:pPr>
-        <w:rPr>
-          <w:rFonts w:hint="eastAsia"/>
-        </w:rPr>
-      </w:pPr>
       <w:r>
         <w:rPr>
           <w:b/>
@@ -1588,10 +1638,7 @@
         <w:t>:</w:t>
       </w:r>
       <w:r>
-        <w:t xml:space="preserve"> </w:t>
-      </w:r>
-      <w:r>
-        <w:t>Optionally hide communities with low connection frequency. Useful for focusing on major communities and reducing visual clutter</w:t>
+        <w:t xml:space="preserve"> Optionally hide communities with low connection frequency. Useful for focusing on major communities and reducing visual clutter</w:t>
       </w:r>
     </w:p>
     <w:p>
@@ -1707,7 +1754,13 @@
         <w:rPr>
           <w:rFonts w:hint="eastAsia"/>
         </w:rPr>
-        <w:t>default: 2000-2024</w:t>
+        <w:t>default: 2000-202</w:t>
+      </w:r>
+      <w:r>
+        <w:rPr>
+          <w:rFonts w:hint="eastAsia"/>
+        </w:rPr>
+        <w:t>5</w:t>
       </w:r>
       <w:r>
         <w:t>). Enables temporal analysis—see how connections evolved over time</w:t>
@@ -1720,9 +1773,6 @@
           <w:ilvl w:val="0"/>
           <w:numId w:val="9"/>
         </w:numPr>
-        <w:rPr>
-          <w:rFonts w:hint="eastAsia"/>
-        </w:rPr>
       </w:pPr>
       <w:r>
         <w:rPr>
@@ -1762,11 +1812,6 @@
       <w:bookmarkEnd w:id="19"/>
     </w:p>
     <w:p>
-      <w:pPr>
-        <w:rPr>
-          <w:rFonts w:hint="eastAsia"/>
-        </w:rPr>
-      </w:pPr>
       <w:r>
         <w:t>Clicking a community node filters the left panel's concept pair list to show only pairs where at least one concept belongs to that community.</w:t>
       </w:r>
@@ -1797,21 +1842,8 @@
       <w:bookmarkEnd w:id="20"/>
     </w:p>
     <w:p>
-      <w:pPr>
-        <w:rPr>
-          <w:rFonts w:hint="eastAsia"/>
-        </w:rPr>
-      </w:pPr>
-      <w:r>
-        <w:t xml:space="preserve">Clicking an edge between two communities filters the concept pair list to show only pairs that connect those two specific communities—where one concept belongs to Community </w:t>
-      </w:r>
-      <w:proofErr w:type="gramStart"/>
-      <w:r>
-        <w:t>A</w:t>
-      </w:r>
-      <w:proofErr w:type="gramEnd"/>
-      <w:r>
-        <w:t xml:space="preserve"> and the other belongs to Community B.</w:t>
+      <w:r>
+        <w:t>Clicking an edge between two communities filters the concept pair list to show only pairs that connect those two specific communities—where one concept belongs to Community A and the other belongs to Community B.</w:t>
       </w:r>
       <w:r>
         <w:rPr>
@@ -1968,7 +2000,16 @@
         <w:t xml:space="preserve">Predicted Connection: </w:t>
       </w:r>
       <w:r>
-        <w:t>Ranks community pairs by connection strength in the Predicted Network (future predictions by 2027)</w:t>
+        <w:t>Ranks community pairs by connection strength in the Predicted Network (future predictions by 20</w:t>
+      </w:r>
+      <w:r>
+        <w:rPr>
+          <w:rFonts w:hint="eastAsia"/>
+        </w:rPr>
+        <w:t>30</w:t>
+      </w:r>
+      <w:r>
+        <w:t>)</w:t>
       </w:r>
     </w:p>
     <w:p>
@@ -2001,7 +2042,6 @@
         <w:spacing w:before="120"/>
         <w:ind w:left="440"/>
         <w:rPr>
-          <w:rFonts w:hint="eastAsia"/>
           <w:b/>
           <w:bCs/>
         </w:rPr>
@@ -2018,7 +2058,7 @@
       <w:pPr>
         <w:pStyle w:val="3"/>
         <w:rPr>
-          <w:rFonts w:eastAsiaTheme="minorEastAsia" w:hint="eastAsia"/>
+          <w:rFonts w:eastAsiaTheme="minorEastAsia"/>
         </w:rPr>
       </w:pPr>
       <w:bookmarkStart w:id="25" w:name="_Toc214833066"/>
@@ -2239,6 +2279,7 @@
         <w:rPr>
           <w:i/>
           <w:iCs/>
+          <w:noProof/>
           <w:color w:val="999999"/>
         </w:rPr>
         <w:drawing>
@@ -3091,11 +3132,6 @@
       </w:r>
     </w:p>
     <w:p>
-      <w:pPr>
-        <w:rPr>
-          <w:rFonts w:hint="eastAsia"/>
-        </w:rPr>
-      </w:pPr>
       <w:r>
         <w:rPr>
           <w:b/>
@@ -3152,7 +3188,16 @@
         </w:numPr>
       </w:pPr>
       <w:r>
-        <w:t>Start with a broad time range (e.g., 2000-2024) to see the overall landscape</w:t>
+        <w:t>Start with a broad time range (e.g., 2000-202</w:t>
+      </w:r>
+      <w:r>
+        <w:rPr>
+          <w:rFonts w:hint="eastAsia"/>
+        </w:rPr>
+        <w:t>5</w:t>
+      </w:r>
+      <w:r>
+        <w:t>) to see the overall landscape</w:t>
       </w:r>
     </w:p>
     <w:p>
@@ -3164,7 +3209,43 @@
         </w:numPr>
       </w:pPr>
       <w:r>
-        <w:t xml:space="preserve">Narrow the range progressively—try recent 10 years (2015-2024), then 5 years (2020-2024) </w:t>
+        <w:t>Narrow the range progressively—try recent 10 years (201</w:t>
+      </w:r>
+      <w:r>
+        <w:rPr>
+          <w:rFonts w:hint="eastAsia"/>
+        </w:rPr>
+        <w:t>6</w:t>
+      </w:r>
+      <w:r>
+        <w:t>-202</w:t>
+      </w:r>
+      <w:r>
+        <w:rPr>
+          <w:rFonts w:hint="eastAsia"/>
+        </w:rPr>
+        <w:t>5</w:t>
+      </w:r>
+      <w:r>
+        <w:t>), then 5 years (202</w:t>
+      </w:r>
+      <w:r>
+        <w:rPr>
+          <w:rFonts w:hint="eastAsia"/>
+        </w:rPr>
+        <w:t>1</w:t>
+      </w:r>
+      <w:r>
+        <w:t>-202</w:t>
+      </w:r>
+      <w:r>
+        <w:rPr>
+          <w:rFonts w:hint="eastAsia"/>
+        </w:rPr>
+        <w:t>5</w:t>
+      </w:r>
+      <w:r>
+        <w:t xml:space="preserve">) </w:t>
       </w:r>
     </w:p>
     <w:p>
@@ -3198,22 +3279,31 @@
           <w:ilvl w:val="0"/>
           <w:numId w:val="18"/>
         </w:numPr>
-        <w:rPr>
-          <w:rFonts w:hint="eastAsia"/>
-        </w:rPr>
-      </w:pPr>
-      <w:r>
-        <w:t>Switch to Predicted Network to see if recent trends are expected to continue or shift by 2027</w:t>
-      </w:r>
+      </w:pPr>
+      <w:r>
+        <w:t>Switch to Predicted Network to see if recent trends are expected to continue or shift by 20</w:t>
+      </w:r>
+      <w:r>
+        <w:rPr>
+          <w:rFonts w:hint="eastAsia"/>
+        </w:rPr>
+        <w:t>30</w:t>
+      </w:r>
+    </w:p>
+    <w:p>
+      <w:pPr>
+        <w:pStyle w:val="a4"/>
+        <w:ind w:left="880"/>
+        <w:rPr>
+          <w:rFonts w:hint="eastAsia"/>
+        </w:rPr>
+      </w:pPr>
     </w:p>
     <w:p>
       <w:pPr>
         <w:pageBreakBefore/>
         <w:spacing w:before="2400" w:after="240"/>
         <w:jc w:val="center"/>
-        <w:rPr>
-          <w:rFonts w:hint="eastAsia"/>
-        </w:rPr>
       </w:pPr>
       <w:r>
         <w:lastRenderedPageBreak/>
@@ -3387,16 +3477,27 @@
           <w:sz w:val="20"/>
           <w:szCs w:val="20"/>
         </w:rPr>
-        <w:t>© 2025 Service Research Compass 2027 Project All Rights Reserved</w:t>
-      </w:r>
-    </w:p>
-    <w:p>
-      <w:pPr>
-        <w:rPr>
-          <w:rFonts w:hint="eastAsia"/>
-        </w:rPr>
-      </w:pPr>
-    </w:p>
+        <w:t>© 2025 Service Research Compass 20</w:t>
+      </w:r>
+      <w:r>
+        <w:rPr>
+          <w:rFonts w:hint="eastAsia"/>
+          <w:color w:val="999999"/>
+          <w:sz w:val="20"/>
+          <w:szCs w:val="20"/>
+        </w:rPr>
+        <w:t>30</w:t>
+      </w:r>
+      <w:r>
+        <w:rPr>
+          <w:color w:val="999999"/>
+          <w:sz w:val="20"/>
+          <w:szCs w:val="20"/>
+        </w:rPr>
+        <w:t xml:space="preserve"> Project All Rights Reserved</w:t>
+      </w:r>
+    </w:p>
+    <w:p/>
     <w:sectPr>
       <w:pgSz w:w="11906" w:h="16838"/>
       <w:pgMar w:top="1440" w:right="1440" w:bottom="1440" w:left="1440" w:header="708" w:footer="708" w:gutter="0"/>
@@ -5478,6 +5579,7 @@
   <w:style w:type="character" w:default="1" w:styleId="a0">
     <w:name w:val="Default Paragraph Font"/>
     <w:uiPriority w:val="1"/>
+    <w:semiHidden/>
     <w:unhideWhenUsed/>
   </w:style>
   <w:style w:type="table" w:default="1" w:styleId="a1">

</xml_diff>